<commit_message>
fix: cap nhat file docx va tu dong don dep tieu chi cu tren IndexedDB app ve 3 tieu chi Nhom 7
</commit_message>
<xml_diff>
--- a/Checklist kiểm tra Phòng Dự án.docx
+++ b/Checklist kiểm tra Phòng Dự án.docx
@@ -3901,18 +3901,18 @@
           <w:p>
             <w:pPr/>
             <w:r>
-              <w:t xml:space="preserve">KH chiếm dụng kho, quỵt nợ khi chưa thu cọc</w:t>
-            </w:r>
-          </w:p>
-        </w:tc>
-        <w:tc>
-          <w:tcPr>
-            <w:tcW w:w="2340" w:type="dxa"/>
-          </w:tcPr>
-          <w:p>
-            <w:pPr/>
-            <w:r>
-              <w:t xml:space="preserve">Cấm giao chìa khóa khi Kế toán chưa xác nhận đã nhận cọc</w:t>
+              <w:t xml:space="preserve">Bàn giao kho khi chưa thu cọc; thiếu BB bàn giao lưu hồ sơ HĐ</w:t>
+            </w:r>
+          </w:p>
+        </w:tc>
+        <w:tc>
+          <w:tcPr>
+            <w:tcW w:w="2340" w:type="dxa"/>
+          </w:tcPr>
+          <w:p>
+            <w:pPr/>
+            <w:r>
+              <w:t xml:space="preserve">Dự án thu hồi và lưu trữ đủ BB bàn giao từ Kho; kiểm tra xác nhận cọc từ Kế toán trước khi đề nghị bàn giao kho</w:t>
             </w:r>
           </w:p>
         </w:tc>
@@ -3947,18 +3947,18 @@
           <w:p>
             <w:pPr/>
             <w:r>
-              <w:t xml:space="preserve">Ghi nhận chậm doanh thu, sót hóa đơn, vi phạm quy định thuế</w:t>
-            </w:r>
-          </w:p>
-        </w:tc>
-        <w:tc>
-          <w:tcPr>
-            <w:tcW w:w="2340" w:type="dxa"/>
-          </w:tcPr>
-          <w:p>
-            <w:pPr/>
-            <w:r>
-              <w:t xml:space="preserve">Chốt số liệu dịch vụ cuối tháng, xuất hóa đơn trước ngày 5 tháng sau</w:t>
+              <w:t xml:space="preserve">Chuyên viên Dự án bỏ mặc công nợ cho Kế toán, nợ đọng kéo dài khó đòi</w:t>
+            </w:r>
+          </w:p>
+        </w:tc>
+        <w:tc>
+          <w:tcPr>
+            <w:tcW w:w="2340" w:type="dxa"/>
+          </w:tcPr>
+          <w:p>
+            <w:pPr/>
+            <w:r>
+              <w:t xml:space="preserve">Chuyên viên Dự án phối hợp Kế toán đôn đốc nợ, gửi thông báo phạt chậm nộp 0,05%/ngày và cảnh báo tạm dừng dịch vụ</w:t>
             </w:r>
           </w:p>
         </w:tc>
@@ -3993,64 +3993,18 @@
           <w:p>
             <w:pPr/>
             <w:r>
-              <w:t xml:space="preserve">Nợ xấu kéo dài, thất thoát vốn lưu động</w:t>
-            </w:r>
-          </w:p>
-        </w:tc>
-        <w:tc>
-          <w:tcPr>
-            <w:tcW w:w="2340" w:type="dxa"/>
-          </w:tcPr>
-          <w:p>
-            <w:pPr/>
-            <w:r>
-              <w:t xml:space="preserve">Tính lãi phạt chậm nộp; tạm dừng dịch vụ/khóa kho nếu nợ quá 30 ngày</w:t>
-            </w:r>
-          </w:p>
-        </w:tc>
-      </w:tr>
-      <w:tr>
-        <w:tc>
-          <w:tcPr>
-            <w:tcW w:w="2340" w:type="dxa"/>
-          </w:tcPr>
-          <w:p>
-            <w:pPr/>
-            <w:r>
-              <w:t xml:space="preserve">E4</w:t>
-            </w:r>
-          </w:p>
-        </w:tc>
-        <w:tc>
-          <w:tcPr>
-            <w:tcW w:w="2340" w:type="dxa"/>
-          </w:tcPr>
-          <w:p>
-            <w:pPr/>
-            <w:r>
-              <w:t xml:space="preserve">CHK-CN-04 · ar_overdue</w:t>
-            </w:r>
-          </w:p>
-        </w:tc>
-        <w:tc>
-          <w:tcPr>
-            <w:tcW w:w="2340" w:type="dxa"/>
-          </w:tcPr>
-          <w:p>
-            <w:pPr/>
-            <w:r>
-              <w:t xml:space="preserve">Hoàn cọc khi KH còn nợ điện, phí dịch vụ hoặc làm hư hỏng kho</w:t>
-            </w:r>
-          </w:p>
-        </w:tc>
-        <w:tc>
-          <w:tcPr>
-            <w:tcW w:w="2340" w:type="dxa"/>
-          </w:tcPr>
-          <w:p>
-            <w:pPr/>
-            <w:r>
-              <w:t xml:space="preserve">Chỉ hoàn cọc sau khi khấu trừ toàn bộ công nợ và chi phí hoàn trả hiện trạng</w:t>
+              <w:t xml:space="preserve">Ký thanh lý khi Kho chưa nhận lại kho hoặc Kế toán chưa đối trừ hết nợ</w:t>
+            </w:r>
+          </w:p>
+        </w:tc>
+        <w:tc>
+          <w:tcPr>
+            <w:tcW w:w="2340" w:type="dxa"/>
+          </w:tcPr>
+          <w:p>
+            <w:pPr/>
+            <w:r>
+              <w:t xml:space="preserve">Dự án chỉ ký thanh lý sau khi nhận đủ BB hoàn trả mặt bằng từ Kho và Xác nhận hết nợ/cấn trừ cọc từ Kế toán</w:t>
             </w:r>
           </w:p>
         </w:tc>

</xml_diff>